<commit_message>
Add Sign up page
</commit_message>
<xml_diff>
--- a/Documentation/Iteration planning.docx
+++ b/Documentation/Iteration planning.docx
@@ -39,6 +39,14 @@
     <w:p/>
     <w:sdt>
       <w:sdtPr>
+        <w:rPr>
+          <w:rFonts w:asciiTheme="minorHAnsi" w:eastAsiaTheme="minorHAnsi" w:hAnsiTheme="minorHAnsi" w:cstheme="minorBidi"/>
+          <w:color w:val="auto"/>
+          <w:kern w:val="2"/>
+          <w:sz w:val="24"/>
+          <w:szCs w:val="24"/>
+          <w14:ligatures w14:val="standardContextual"/>
+        </w:rPr>
         <w:id w:val="2071527007"/>
         <w:docPartObj>
           <w:docPartGallery w:val="Table of Contents"/>
@@ -47,15 +55,9 @@
       </w:sdtPr>
       <w:sdtEndPr>
         <w:rPr>
-          <w:rFonts w:asciiTheme="minorHAnsi" w:eastAsiaTheme="minorHAnsi" w:hAnsiTheme="minorHAnsi" w:cstheme="minorBidi"/>
           <w:b/>
           <w:bCs/>
           <w:noProof/>
-          <w:color w:val="auto"/>
-          <w:kern w:val="2"/>
-          <w:sz w:val="24"/>
-          <w:szCs w:val="24"/>
-          <w14:ligatures w14:val="standardContextual"/>
         </w:rPr>
       </w:sdtEndPr>
       <w:sdtContent>
@@ -74,6 +76,7 @@
               <w:tab w:val="right" w:leader="dot" w:pos="9350"/>
             </w:tabs>
             <w:rPr>
+              <w:rFonts w:eastAsiaTheme="minorEastAsia"/>
               <w:noProof/>
             </w:rPr>
           </w:pPr>
@@ -86,7 +89,7 @@
           <w:r>
             <w:fldChar w:fldCharType="separate"/>
           </w:r>
-          <w:hyperlink w:anchor="_Toc195086519" w:history="1">
+          <w:hyperlink w:anchor="_Toc196381077" w:history="1">
             <w:r>
               <w:rPr>
                 <w:rStyle w:val="Hyperlink"/>
@@ -113,7 +116,7 @@
                 <w:noProof/>
                 <w:webHidden/>
               </w:rPr>
-              <w:instrText xml:space="preserve"> PAGEREF _Toc195086519 \h </w:instrText>
+              <w:instrText xml:space="preserve"> PAGEREF _Toc196381077 \h </w:instrText>
             </w:r>
             <w:r>
               <w:rPr>
@@ -151,10 +154,11 @@
               <w:tab w:val="right" w:leader="dot" w:pos="9350"/>
             </w:tabs>
             <w:rPr>
+              <w:rFonts w:eastAsiaTheme="minorEastAsia"/>
               <w:noProof/>
             </w:rPr>
           </w:pPr>
-          <w:hyperlink w:anchor="_Toc195086520" w:history="1">
+          <w:hyperlink w:anchor="_Toc196381078" w:history="1">
             <w:r>
               <w:rPr>
                 <w:rStyle w:val="Hyperlink"/>
@@ -181,7 +185,7 @@
                 <w:noProof/>
                 <w:webHidden/>
               </w:rPr>
-              <w:instrText xml:space="preserve"> PAGEREF _Toc195086520 \h </w:instrText>
+              <w:instrText xml:space="preserve"> PAGEREF _Toc196381078 \h </w:instrText>
             </w:r>
             <w:r>
               <w:rPr>
@@ -219,10 +223,11 @@
               <w:tab w:val="right" w:leader="dot" w:pos="9350"/>
             </w:tabs>
             <w:rPr>
+              <w:rFonts w:eastAsiaTheme="minorEastAsia"/>
               <w:noProof/>
             </w:rPr>
           </w:pPr>
-          <w:hyperlink w:anchor="_Toc195086521" w:history="1">
+          <w:hyperlink w:anchor="_Toc196381079" w:history="1">
             <w:r>
               <w:rPr>
                 <w:rStyle w:val="Hyperlink"/>
@@ -249,7 +254,76 @@
                 <w:noProof/>
                 <w:webHidden/>
               </w:rPr>
-              <w:instrText xml:space="preserve"> PAGEREF _Toc195086521 \h </w:instrText>
+              <w:instrText xml:space="preserve"> PAGEREF _Toc196381079 \h </w:instrText>
+            </w:r>
+            <w:r>
+              <w:rPr>
+                <w:noProof/>
+                <w:webHidden/>
+              </w:rPr>
+            </w:r>
+            <w:r>
+              <w:rPr>
+                <w:noProof/>
+                <w:webHidden/>
+              </w:rPr>
+              <w:fldChar w:fldCharType="separate"/>
+            </w:r>
+            <w:r>
+              <w:rPr>
+                <w:noProof/>
+                <w:webHidden/>
+              </w:rPr>
+              <w:t>2</w:t>
+            </w:r>
+            <w:r>
+              <w:rPr>
+                <w:noProof/>
+                <w:webHidden/>
+              </w:rPr>
+              <w:fldChar w:fldCharType="end"/>
+            </w:r>
+          </w:hyperlink>
+        </w:p>
+        <w:p>
+          <w:pPr>
+            <w:pStyle w:val="TOC1"/>
+            <w:tabs>
+              <w:tab w:val="right" w:leader="dot" w:pos="9350"/>
+            </w:tabs>
+            <w:rPr>
+              <w:rFonts w:eastAsiaTheme="minorEastAsia"/>
+              <w:noProof/>
+            </w:rPr>
+          </w:pPr>
+          <w:hyperlink w:anchor="_Toc196381080" w:history="1">
+            <w:r>
+              <w:rPr>
+                <w:rStyle w:val="Hyperlink"/>
+                <w:noProof/>
+              </w:rPr>
+              <w:t>Iteration 3</w:t>
+            </w:r>
+            <w:r>
+              <w:rPr>
+                <w:noProof/>
+                <w:webHidden/>
+              </w:rPr>
+              <w:tab/>
+            </w:r>
+            <w:r>
+              <w:rPr>
+                <w:noProof/>
+                <w:webHidden/>
+              </w:rPr>
+              <w:fldChar w:fldCharType="begin"/>
+            </w:r>
+            <w:r>
+              <w:rPr>
+                <w:noProof/>
+                <w:webHidden/>
+              </w:rPr>
+              <w:instrText xml:space="preserve"> PAGEREF _Toc196381080 \h </w:instrText>
             </w:r>
             <w:r>
               <w:rPr>
@@ -299,7 +373,7 @@
         <w:pStyle w:val="Heading1"/>
         <w:jc w:val="center"/>
       </w:pPr>
-      <w:bookmarkStart w:id="0" w:name="_Toc195086519"/>
+      <w:bookmarkStart w:id="0" w:name="_Toc196381077"/>
       <w:r>
         <w:t>Introduction</w:t>
       </w:r>
@@ -403,7 +477,7 @@
         <w:pStyle w:val="Heading1"/>
         <w:jc w:val="center"/>
       </w:pPr>
-      <w:bookmarkStart w:id="1" w:name="_Toc195086520"/>
+      <w:bookmarkStart w:id="1" w:name="_Toc196381078"/>
       <w:r>
         <w:t>Iteration 1</w:t>
       </w:r>
@@ -441,6 +515,7 @@
           <w:sz w:val="28"/>
           <w:szCs w:val="28"/>
         </w:rPr>
+        <w:lastRenderedPageBreak/>
         <w:t>Come up with an idea</w:t>
       </w:r>
       <w:r>
@@ -475,7 +550,6 @@
           <w:sz w:val="28"/>
           <w:szCs w:val="28"/>
         </w:rPr>
-        <w:lastRenderedPageBreak/>
         <w:t>Pitch the idea</w:t>
       </w:r>
       <w:r>
@@ -724,7 +798,7 @@
         <w:pStyle w:val="Heading1"/>
         <w:jc w:val="center"/>
       </w:pPr>
-      <w:bookmarkStart w:id="2" w:name="_Toc195086521"/>
+      <w:bookmarkStart w:id="2" w:name="_Toc196381079"/>
       <w:r>
         <w:t>Iteration 2</w:t>
       </w:r>
@@ -908,6 +982,13 @@
         </w:rPr>
         <w:t xml:space="preserve"> </w:t>
       </w:r>
+      <w:r>
+        <w:rPr>
+          <w:sz w:val="28"/>
+          <w:szCs w:val="28"/>
+        </w:rPr>
+        <w:t>✓</w:t>
+      </w:r>
     </w:p>
     <w:p>
       <w:pPr>
@@ -1036,6 +1117,163 @@
           <w:szCs w:val="28"/>
         </w:rPr>
         <w:t>✓</w:t>
+      </w:r>
+    </w:p>
+    <w:p>
+      <w:pPr>
+        <w:rPr>
+          <w:sz w:val="28"/>
+          <w:szCs w:val="28"/>
+        </w:rPr>
+      </w:pPr>
+    </w:p>
+    <w:p>
+      <w:pPr>
+        <w:rPr>
+          <w:sz w:val="28"/>
+          <w:szCs w:val="28"/>
+        </w:rPr>
+      </w:pPr>
+    </w:p>
+    <w:p>
+      <w:pPr>
+        <w:pStyle w:val="Heading1"/>
+        <w:jc w:val="center"/>
+      </w:pPr>
+      <w:bookmarkStart w:id="3" w:name="_Toc196381080"/>
+      <w:r>
+        <w:t>Iteration 3</w:t>
+      </w:r>
+      <w:bookmarkEnd w:id="3"/>
+    </w:p>
+    <w:p>
+      <w:pPr>
+        <w:rPr>
+          <w:sz w:val="28"/>
+          <w:szCs w:val="28"/>
+        </w:rPr>
+      </w:pPr>
+      <w:r>
+        <w:rPr>
+          <w:sz w:val="28"/>
+          <w:szCs w:val="28"/>
+        </w:rPr>
+        <w:t xml:space="preserve">This iteration my plan is to focus mainly on implementation – both frontend and backend, since I have created a good foundation for myself via </w:t>
+      </w:r>
+      <w:r>
+        <w:rPr>
+          <w:sz w:val="28"/>
+          <w:szCs w:val="28"/>
+        </w:rPr>
+        <w:lastRenderedPageBreak/>
+        <w:t>documentation, diagrams and prototype, so I can confidently put all my focus on the next step.</w:t>
+      </w:r>
+    </w:p>
+    <w:p>
+      <w:pPr>
+        <w:pStyle w:val="ListParagraph"/>
+        <w:numPr>
+          <w:ilvl w:val="0"/>
+          <w:numId w:val="3"/>
+        </w:numPr>
+        <w:rPr>
+          <w:sz w:val="28"/>
+          <w:szCs w:val="28"/>
+        </w:rPr>
+      </w:pPr>
+      <w:r>
+        <w:rPr>
+          <w:sz w:val="28"/>
+          <w:szCs w:val="28"/>
+        </w:rPr>
+        <w:t xml:space="preserve">Improve the structure of my project - </w:t>
+      </w:r>
+      <w:r>
+        <w:rPr>
+          <w:sz w:val="28"/>
+          <w:szCs w:val="28"/>
+        </w:rPr>
+        <w:t>✓</w:t>
+      </w:r>
+    </w:p>
+    <w:p>
+      <w:pPr>
+        <w:pStyle w:val="ListParagraph"/>
+        <w:numPr>
+          <w:ilvl w:val="0"/>
+          <w:numId w:val="3"/>
+        </w:numPr>
+        <w:rPr>
+          <w:sz w:val="28"/>
+          <w:szCs w:val="28"/>
+        </w:rPr>
+      </w:pPr>
+      <w:r>
+        <w:rPr>
+          <w:sz w:val="28"/>
+          <w:szCs w:val="28"/>
+        </w:rPr>
+        <w:t>Create all the pages for my application -</w:t>
+      </w:r>
+    </w:p>
+    <w:p>
+      <w:pPr>
+        <w:pStyle w:val="ListParagraph"/>
+        <w:numPr>
+          <w:ilvl w:val="0"/>
+          <w:numId w:val="3"/>
+        </w:numPr>
+        <w:rPr>
+          <w:sz w:val="28"/>
+          <w:szCs w:val="28"/>
+        </w:rPr>
+      </w:pPr>
+      <w:r>
+        <w:rPr>
+          <w:sz w:val="28"/>
+          <w:szCs w:val="28"/>
+        </w:rPr>
+        <w:t>Implement the most important functionality –</w:t>
+      </w:r>
+    </w:p>
+    <w:p>
+      <w:pPr>
+        <w:pStyle w:val="ListParagraph"/>
+        <w:numPr>
+          <w:ilvl w:val="0"/>
+          <w:numId w:val="3"/>
+        </w:numPr>
+        <w:rPr>
+          <w:sz w:val="28"/>
+          <w:szCs w:val="28"/>
+        </w:rPr>
+      </w:pPr>
+      <w:r>
+        <w:rPr>
+          <w:sz w:val="28"/>
+          <w:szCs w:val="28"/>
+        </w:rPr>
+        <w:t>Update diagrams and documentation, based on the progress made –</w:t>
+      </w:r>
+    </w:p>
+    <w:p>
+      <w:pPr>
+        <w:pStyle w:val="ListParagraph"/>
+        <w:numPr>
+          <w:ilvl w:val="0"/>
+          <w:numId w:val="3"/>
+        </w:numPr>
+        <w:rPr>
+          <w:sz w:val="28"/>
+          <w:szCs w:val="28"/>
+        </w:rPr>
+      </w:pPr>
+      <w:r>
+        <w:rPr>
+          <w:sz w:val="28"/>
+          <w:szCs w:val="28"/>
+        </w:rPr>
+        <w:t xml:space="preserve">Continue seeking feedback - </w:t>
       </w:r>
     </w:p>
     <w:sectPr>
@@ -1164,9 +1402,9 @@
     </w:lvl>
   </w:abstractNum>
   <w:abstractNum w:abstractNumId="1" w15:restartNumberingAfterBreak="0">
-    <w:nsid w:val="626E6CA3"/>
+    <w:nsid w:val="47776B4B"/>
     <w:multiLevelType w:val="hybridMultilevel"/>
-    <w:tmpl w:val="15A6C858"/>
+    <w:tmpl w:val="C28625EE"/>
     <w:lvl w:ilvl="0" w:tplc="04090001">
       <w:start w:val="1"/>
       <w:numFmt w:val="bullet"/>
@@ -1276,11 +1514,127 @@
       </w:rPr>
     </w:lvl>
   </w:abstractNum>
+  <w:abstractNum w:abstractNumId="2" w15:restartNumberingAfterBreak="0">
+    <w:nsid w:val="626E6CA3"/>
+    <w:multiLevelType w:val="hybridMultilevel"/>
+    <w:tmpl w:val="15A6C858"/>
+    <w:lvl w:ilvl="0" w:tplc="04090001">
+      <w:start w:val="1"/>
+      <w:numFmt w:val="bullet"/>
+      <w:lvlText w:val=""/>
+      <w:lvlJc w:val="left"/>
+      <w:pPr>
+        <w:ind w:left="720" w:hanging="360"/>
+      </w:pPr>
+      <w:rPr>
+        <w:rFonts w:ascii="Symbol" w:hAnsi="Symbol" w:hint="default"/>
+      </w:rPr>
+    </w:lvl>
+    <w:lvl w:ilvl="1" w:tplc="04090003" w:tentative="1">
+      <w:start w:val="1"/>
+      <w:numFmt w:val="bullet"/>
+      <w:lvlText w:val="o"/>
+      <w:lvlJc w:val="left"/>
+      <w:pPr>
+        <w:ind w:left="1440" w:hanging="360"/>
+      </w:pPr>
+      <w:rPr>
+        <w:rFonts w:ascii="Courier New" w:hAnsi="Courier New" w:cs="Courier New" w:hint="default"/>
+      </w:rPr>
+    </w:lvl>
+    <w:lvl w:ilvl="2" w:tplc="04090005" w:tentative="1">
+      <w:start w:val="1"/>
+      <w:numFmt w:val="bullet"/>
+      <w:lvlText w:val=""/>
+      <w:lvlJc w:val="left"/>
+      <w:pPr>
+        <w:ind w:left="2160" w:hanging="360"/>
+      </w:pPr>
+      <w:rPr>
+        <w:rFonts w:ascii="Wingdings" w:hAnsi="Wingdings" w:hint="default"/>
+      </w:rPr>
+    </w:lvl>
+    <w:lvl w:ilvl="3" w:tplc="04090001" w:tentative="1">
+      <w:start w:val="1"/>
+      <w:numFmt w:val="bullet"/>
+      <w:lvlText w:val=""/>
+      <w:lvlJc w:val="left"/>
+      <w:pPr>
+        <w:ind w:left="2880" w:hanging="360"/>
+      </w:pPr>
+      <w:rPr>
+        <w:rFonts w:ascii="Symbol" w:hAnsi="Symbol" w:hint="default"/>
+      </w:rPr>
+    </w:lvl>
+    <w:lvl w:ilvl="4" w:tplc="04090003" w:tentative="1">
+      <w:start w:val="1"/>
+      <w:numFmt w:val="bullet"/>
+      <w:lvlText w:val="o"/>
+      <w:lvlJc w:val="left"/>
+      <w:pPr>
+        <w:ind w:left="3600" w:hanging="360"/>
+      </w:pPr>
+      <w:rPr>
+        <w:rFonts w:ascii="Courier New" w:hAnsi="Courier New" w:cs="Courier New" w:hint="default"/>
+      </w:rPr>
+    </w:lvl>
+    <w:lvl w:ilvl="5" w:tplc="04090005" w:tentative="1">
+      <w:start w:val="1"/>
+      <w:numFmt w:val="bullet"/>
+      <w:lvlText w:val=""/>
+      <w:lvlJc w:val="left"/>
+      <w:pPr>
+        <w:ind w:left="4320" w:hanging="360"/>
+      </w:pPr>
+      <w:rPr>
+        <w:rFonts w:ascii="Wingdings" w:hAnsi="Wingdings" w:hint="default"/>
+      </w:rPr>
+    </w:lvl>
+    <w:lvl w:ilvl="6" w:tplc="04090001" w:tentative="1">
+      <w:start w:val="1"/>
+      <w:numFmt w:val="bullet"/>
+      <w:lvlText w:val=""/>
+      <w:lvlJc w:val="left"/>
+      <w:pPr>
+        <w:ind w:left="5040" w:hanging="360"/>
+      </w:pPr>
+      <w:rPr>
+        <w:rFonts w:ascii="Symbol" w:hAnsi="Symbol" w:hint="default"/>
+      </w:rPr>
+    </w:lvl>
+    <w:lvl w:ilvl="7" w:tplc="04090003" w:tentative="1">
+      <w:start w:val="1"/>
+      <w:numFmt w:val="bullet"/>
+      <w:lvlText w:val="o"/>
+      <w:lvlJc w:val="left"/>
+      <w:pPr>
+        <w:ind w:left="5760" w:hanging="360"/>
+      </w:pPr>
+      <w:rPr>
+        <w:rFonts w:ascii="Courier New" w:hAnsi="Courier New" w:cs="Courier New" w:hint="default"/>
+      </w:rPr>
+    </w:lvl>
+    <w:lvl w:ilvl="8" w:tplc="04090005" w:tentative="1">
+      <w:start w:val="1"/>
+      <w:numFmt w:val="bullet"/>
+      <w:lvlText w:val=""/>
+      <w:lvlJc w:val="left"/>
+      <w:pPr>
+        <w:ind w:left="6480" w:hanging="360"/>
+      </w:pPr>
+      <w:rPr>
+        <w:rFonts w:ascii="Wingdings" w:hAnsi="Wingdings" w:hint="default"/>
+      </w:rPr>
+    </w:lvl>
+  </w:abstractNum>
   <w:num w:numId="1" w16cid:durableId="1969165278">
-    <w:abstractNumId w:val="1"/>
+    <w:abstractNumId w:val="2"/>
   </w:num>
   <w:num w:numId="2" w16cid:durableId="806168282">
     <w:abstractNumId w:val="0"/>
+  </w:num>
+  <w:num w:numId="3" w16cid:durableId="638539266">
+    <w:abstractNumId w:val="1"/>
   </w:num>
 </w:numbering>
 </file>

</xml_diff>

<commit_message>
Improve referencing between layers and some other fixes
</commit_message>
<xml_diff>
--- a/Documentation/Iteration planning.docx
+++ b/Documentation/Iteration planning.docx
@@ -89,7 +89,7 @@
           <w:r>
             <w:fldChar w:fldCharType="separate"/>
           </w:r>
-          <w:hyperlink w:anchor="_Toc196381077" w:history="1">
+          <w:hyperlink w:anchor="_Toc197586464" w:history="1">
             <w:r>
               <w:rPr>
                 <w:rStyle w:val="Hyperlink"/>
@@ -116,7 +116,7 @@
                 <w:noProof/>
                 <w:webHidden/>
               </w:rPr>
-              <w:instrText xml:space="preserve"> PAGEREF _Toc196381077 \h </w:instrText>
+              <w:instrText xml:space="preserve"> PAGEREF _Toc197586464 \h </w:instrText>
             </w:r>
             <w:r>
               <w:rPr>
@@ -158,7 +158,7 @@
               <w:noProof/>
             </w:rPr>
           </w:pPr>
-          <w:hyperlink w:anchor="_Toc196381078" w:history="1">
+          <w:hyperlink w:anchor="_Toc197586465" w:history="1">
             <w:r>
               <w:rPr>
                 <w:rStyle w:val="Hyperlink"/>
@@ -185,7 +185,7 @@
                 <w:noProof/>
                 <w:webHidden/>
               </w:rPr>
-              <w:instrText xml:space="preserve"> PAGEREF _Toc196381078 \h </w:instrText>
+              <w:instrText xml:space="preserve"> PAGEREF _Toc197586465 \h </w:instrText>
             </w:r>
             <w:r>
               <w:rPr>
@@ -227,7 +227,7 @@
               <w:noProof/>
             </w:rPr>
           </w:pPr>
-          <w:hyperlink w:anchor="_Toc196381079" w:history="1">
+          <w:hyperlink w:anchor="_Toc197586466" w:history="1">
             <w:r>
               <w:rPr>
                 <w:rStyle w:val="Hyperlink"/>
@@ -254,7 +254,7 @@
                 <w:noProof/>
                 <w:webHidden/>
               </w:rPr>
-              <w:instrText xml:space="preserve"> PAGEREF _Toc196381079 \h </w:instrText>
+              <w:instrText xml:space="preserve"> PAGEREF _Toc197586466 \h </w:instrText>
             </w:r>
             <w:r>
               <w:rPr>
@@ -296,7 +296,7 @@
               <w:noProof/>
             </w:rPr>
           </w:pPr>
-          <w:hyperlink w:anchor="_Toc196381080" w:history="1">
+          <w:hyperlink w:anchor="_Toc197586467" w:history="1">
             <w:r>
               <w:rPr>
                 <w:rStyle w:val="Hyperlink"/>
@@ -323,7 +323,7 @@
                 <w:noProof/>
                 <w:webHidden/>
               </w:rPr>
-              <w:instrText xml:space="preserve"> PAGEREF _Toc196381080 \h </w:instrText>
+              <w:instrText xml:space="preserve"> PAGEREF _Toc197586467 \h </w:instrText>
             </w:r>
             <w:r>
               <w:rPr>
@@ -373,7 +373,7 @@
         <w:pStyle w:val="Heading1"/>
         <w:jc w:val="center"/>
       </w:pPr>
-      <w:bookmarkStart w:id="0" w:name="_Toc196381077"/>
+      <w:bookmarkStart w:id="0" w:name="_Toc197586464"/>
       <w:r>
         <w:t>Introduction</w:t>
       </w:r>
@@ -477,7 +477,7 @@
         <w:pStyle w:val="Heading1"/>
         <w:jc w:val="center"/>
       </w:pPr>
-      <w:bookmarkStart w:id="1" w:name="_Toc196381078"/>
+      <w:bookmarkStart w:id="1" w:name="_Toc197586465"/>
       <w:r>
         <w:t>Iteration 1</w:t>
       </w:r>
@@ -798,7 +798,7 @@
         <w:pStyle w:val="Heading1"/>
         <w:jc w:val="center"/>
       </w:pPr>
-      <w:bookmarkStart w:id="2" w:name="_Toc196381079"/>
+      <w:bookmarkStart w:id="2" w:name="_Toc197586466"/>
       <w:r>
         <w:t>Iteration 2</w:t>
       </w:r>
@@ -1140,7 +1140,7 @@
         <w:pStyle w:val="Heading1"/>
         <w:jc w:val="center"/>
       </w:pPr>
-      <w:bookmarkStart w:id="3" w:name="_Toc196381080"/>
+      <w:bookmarkStart w:id="3" w:name="_Toc197586467"/>
       <w:r>
         <w:t>Iteration 3</w:t>
       </w:r>
@@ -1215,6 +1215,20 @@
         </w:rPr>
         <w:t>Create all the pages for my application -</w:t>
       </w:r>
+      <w:r>
+        <w:rPr>
+          <w:sz w:val="28"/>
+          <w:szCs w:val="28"/>
+        </w:rPr>
+        <w:t xml:space="preserve"> </w:t>
+      </w:r>
+      <w:r>
+        <w:rPr>
+          <w:sz w:val="28"/>
+          <w:szCs w:val="28"/>
+        </w:rPr>
+        <w:t>✓</w:t>
+      </w:r>
     </w:p>
     <w:p>
       <w:pPr>
@@ -1274,6 +1288,13 @@
           <w:szCs w:val="28"/>
         </w:rPr>
         <w:t xml:space="preserve">Continue seeking feedback - </w:t>
+      </w:r>
+      <w:r>
+        <w:rPr>
+          <w:sz w:val="28"/>
+          <w:szCs w:val="28"/>
+        </w:rPr>
+        <w:t>✓</w:t>
       </w:r>
     </w:p>
     <w:sectPr>

</xml_diff>

<commit_message>
Add some documentation and Add more Unit tests for Employee Service
</commit_message>
<xml_diff>
--- a/Documentation/Iteration planning.docx
+++ b/Documentation/Iteration planning.docx
@@ -89,7 +89,7 @@
           <w:r>
             <w:fldChar w:fldCharType="separate"/>
           </w:r>
-          <w:hyperlink w:anchor="_Toc197586464" w:history="1">
+          <w:hyperlink w:anchor="_Toc199422993" w:history="1">
             <w:r>
               <w:rPr>
                 <w:rStyle w:val="Hyperlink"/>
@@ -116,7 +116,7 @@
                 <w:noProof/>
                 <w:webHidden/>
               </w:rPr>
-              <w:instrText xml:space="preserve"> PAGEREF _Toc197586464 \h </w:instrText>
+              <w:instrText xml:space="preserve"> PAGEREF _Toc199422993 \h </w:instrText>
             </w:r>
             <w:r>
               <w:rPr>
@@ -158,7 +158,7 @@
               <w:noProof/>
             </w:rPr>
           </w:pPr>
-          <w:hyperlink w:anchor="_Toc197586465" w:history="1">
+          <w:hyperlink w:anchor="_Toc199422994" w:history="1">
             <w:r>
               <w:rPr>
                 <w:rStyle w:val="Hyperlink"/>
@@ -185,7 +185,7 @@
                 <w:noProof/>
                 <w:webHidden/>
               </w:rPr>
-              <w:instrText xml:space="preserve"> PAGEREF _Toc197586465 \h </w:instrText>
+              <w:instrText xml:space="preserve"> PAGEREF _Toc199422994 \h </w:instrText>
             </w:r>
             <w:r>
               <w:rPr>
@@ -227,7 +227,7 @@
               <w:noProof/>
             </w:rPr>
           </w:pPr>
-          <w:hyperlink w:anchor="_Toc197586466" w:history="1">
+          <w:hyperlink w:anchor="_Toc199422995" w:history="1">
             <w:r>
               <w:rPr>
                 <w:rStyle w:val="Hyperlink"/>
@@ -254,7 +254,7 @@
                 <w:noProof/>
                 <w:webHidden/>
               </w:rPr>
-              <w:instrText xml:space="preserve"> PAGEREF _Toc197586466 \h </w:instrText>
+              <w:instrText xml:space="preserve"> PAGEREF _Toc199422995 \h </w:instrText>
             </w:r>
             <w:r>
               <w:rPr>
@@ -296,7 +296,7 @@
               <w:noProof/>
             </w:rPr>
           </w:pPr>
-          <w:hyperlink w:anchor="_Toc197586467" w:history="1">
+          <w:hyperlink w:anchor="_Toc199422996" w:history="1">
             <w:r>
               <w:rPr>
                 <w:rStyle w:val="Hyperlink"/>
@@ -323,7 +323,7 @@
                 <w:noProof/>
                 <w:webHidden/>
               </w:rPr>
-              <w:instrText xml:space="preserve"> PAGEREF _Toc197586467 \h </w:instrText>
+              <w:instrText xml:space="preserve"> PAGEREF _Toc199422996 \h </w:instrText>
             </w:r>
             <w:r>
               <w:rPr>
@@ -344,6 +344,75 @@
                 <w:webHidden/>
               </w:rPr>
               <w:t>2</w:t>
+            </w:r>
+            <w:r>
+              <w:rPr>
+                <w:noProof/>
+                <w:webHidden/>
+              </w:rPr>
+              <w:fldChar w:fldCharType="end"/>
+            </w:r>
+          </w:hyperlink>
+        </w:p>
+        <w:p>
+          <w:pPr>
+            <w:pStyle w:val="TOC1"/>
+            <w:tabs>
+              <w:tab w:val="right" w:leader="dot" w:pos="9350"/>
+            </w:tabs>
+            <w:rPr>
+              <w:rFonts w:eastAsiaTheme="minorEastAsia"/>
+              <w:noProof/>
+            </w:rPr>
+          </w:pPr>
+          <w:hyperlink w:anchor="_Toc199422997" w:history="1">
+            <w:r>
+              <w:rPr>
+                <w:rStyle w:val="Hyperlink"/>
+                <w:noProof/>
+              </w:rPr>
+              <w:t>Iteration 4</w:t>
+            </w:r>
+            <w:r>
+              <w:rPr>
+                <w:noProof/>
+                <w:webHidden/>
+              </w:rPr>
+              <w:tab/>
+            </w:r>
+            <w:r>
+              <w:rPr>
+                <w:noProof/>
+                <w:webHidden/>
+              </w:rPr>
+              <w:fldChar w:fldCharType="begin"/>
+            </w:r>
+            <w:r>
+              <w:rPr>
+                <w:noProof/>
+                <w:webHidden/>
+              </w:rPr>
+              <w:instrText xml:space="preserve"> PAGEREF _Toc199422997 \h </w:instrText>
+            </w:r>
+            <w:r>
+              <w:rPr>
+                <w:noProof/>
+                <w:webHidden/>
+              </w:rPr>
+            </w:r>
+            <w:r>
+              <w:rPr>
+                <w:noProof/>
+                <w:webHidden/>
+              </w:rPr>
+              <w:fldChar w:fldCharType="separate"/>
+            </w:r>
+            <w:r>
+              <w:rPr>
+                <w:noProof/>
+                <w:webHidden/>
+              </w:rPr>
+              <w:t>3</w:t>
             </w:r>
             <w:r>
               <w:rPr>
@@ -373,7 +442,7 @@
         <w:pStyle w:val="Heading1"/>
         <w:jc w:val="center"/>
       </w:pPr>
-      <w:bookmarkStart w:id="0" w:name="_Toc197586464"/>
+      <w:bookmarkStart w:id="0" w:name="_Toc199422993"/>
       <w:r>
         <w:t>Introduction</w:t>
       </w:r>
@@ -477,7 +546,7 @@
         <w:pStyle w:val="Heading1"/>
         <w:jc w:val="center"/>
       </w:pPr>
-      <w:bookmarkStart w:id="1" w:name="_Toc197586465"/>
+      <w:bookmarkStart w:id="1" w:name="_Toc199422994"/>
       <w:r>
         <w:t>Iteration 1</w:t>
       </w:r>
@@ -798,7 +867,7 @@
         <w:pStyle w:val="Heading1"/>
         <w:jc w:val="center"/>
       </w:pPr>
-      <w:bookmarkStart w:id="2" w:name="_Toc197586466"/>
+      <w:bookmarkStart w:id="2" w:name="_Toc199422995"/>
       <w:r>
         <w:t>Iteration 2</w:t>
       </w:r>
@@ -1140,7 +1209,7 @@
         <w:pStyle w:val="Heading1"/>
         <w:jc w:val="center"/>
       </w:pPr>
-      <w:bookmarkStart w:id="3" w:name="_Toc197586467"/>
+      <w:bookmarkStart w:id="3" w:name="_Toc199422996"/>
       <w:r>
         <w:t>Iteration 3</w:t>
       </w:r>
@@ -1330,6 +1399,225 @@
           <w:szCs w:val="28"/>
         </w:rPr>
         <w:t xml:space="preserve">Continue seeking feedback - </w:t>
+      </w:r>
+      <w:r>
+        <w:rPr>
+          <w:sz w:val="28"/>
+          <w:szCs w:val="28"/>
+        </w:rPr>
+        <w:t>✓</w:t>
+      </w:r>
+    </w:p>
+    <w:p>
+      <w:pPr>
+        <w:rPr>
+          <w:sz w:val="28"/>
+          <w:szCs w:val="28"/>
+        </w:rPr>
+      </w:pPr>
+    </w:p>
+    <w:p>
+      <w:pPr>
+        <w:pStyle w:val="Heading1"/>
+        <w:jc w:val="center"/>
+      </w:pPr>
+      <w:bookmarkStart w:id="4" w:name="_Toc199422997"/>
+      <w:r>
+        <w:t>Iteration 4</w:t>
+      </w:r>
+      <w:bookmarkEnd w:id="4"/>
+    </w:p>
+    <w:p>
+      <w:pPr>
+        <w:rPr>
+          <w:sz w:val="28"/>
+          <w:szCs w:val="28"/>
+        </w:rPr>
+      </w:pPr>
+      <w:r>
+        <w:rPr>
+          <w:sz w:val="28"/>
+          <w:szCs w:val="28"/>
+        </w:rPr>
+        <w:t>This iteration my plan is to continue developing the functionality of my app, namely start implementing the inventory page of my Warehouse management system. I also want to put more focus into testing so I am going to create some Unit tests, which will help me check whether my methods work correctly.</w:t>
+      </w:r>
+    </w:p>
+    <w:p>
+      <w:pPr>
+        <w:rPr>
+          <w:sz w:val="28"/>
+          <w:szCs w:val="28"/>
+        </w:rPr>
+      </w:pPr>
+    </w:p>
+    <w:p>
+      <w:pPr>
+        <w:pStyle w:val="ListParagraph"/>
+        <w:numPr>
+          <w:ilvl w:val="0"/>
+          <w:numId w:val="4"/>
+        </w:numPr>
+        <w:rPr>
+          <w:sz w:val="28"/>
+          <w:szCs w:val="28"/>
+        </w:rPr>
+      </w:pPr>
+      <w:r>
+        <w:rPr>
+          <w:sz w:val="28"/>
+          <w:szCs w:val="28"/>
+        </w:rPr>
+        <w:t xml:space="preserve">Finalize and polish the Employee functionality – </w:t>
+      </w:r>
+      <w:r>
+        <w:rPr>
+          <w:sz w:val="28"/>
+          <w:szCs w:val="28"/>
+        </w:rPr>
+        <w:t>✓</w:t>
+      </w:r>
+    </w:p>
+    <w:p>
+      <w:pPr>
+        <w:pStyle w:val="ListParagraph"/>
+        <w:numPr>
+          <w:ilvl w:val="0"/>
+          <w:numId w:val="4"/>
+        </w:numPr>
+        <w:rPr>
+          <w:sz w:val="28"/>
+          <w:szCs w:val="28"/>
+        </w:rPr>
+      </w:pPr>
+      <w:r>
+        <w:rPr>
+          <w:sz w:val="28"/>
+          <w:szCs w:val="28"/>
+        </w:rPr>
+        <w:t>Start implementing</w:t>
+      </w:r>
+      <w:r>
+        <w:rPr>
+          <w:sz w:val="28"/>
+          <w:szCs w:val="28"/>
+        </w:rPr>
+        <w:t xml:space="preserve"> the Inventory functionality – </w:t>
+      </w:r>
+      <w:r>
+        <w:rPr>
+          <w:sz w:val="28"/>
+          <w:szCs w:val="28"/>
+        </w:rPr>
+        <w:t>✓</w:t>
+      </w:r>
+    </w:p>
+    <w:p>
+      <w:pPr>
+        <w:pStyle w:val="ListParagraph"/>
+        <w:numPr>
+          <w:ilvl w:val="0"/>
+          <w:numId w:val="4"/>
+        </w:numPr>
+        <w:rPr>
+          <w:sz w:val="28"/>
+          <w:szCs w:val="28"/>
+        </w:rPr>
+      </w:pPr>
+      <w:r>
+        <w:rPr>
+          <w:sz w:val="28"/>
+          <w:szCs w:val="28"/>
+        </w:rPr>
+        <w:t xml:space="preserve">Create Unit tests – </w:t>
+      </w:r>
+      <w:r>
+        <w:rPr>
+          <w:sz w:val="28"/>
+          <w:szCs w:val="28"/>
+        </w:rPr>
+        <w:t>✓</w:t>
+      </w:r>
+    </w:p>
+    <w:p>
+      <w:pPr>
+        <w:pStyle w:val="ListParagraph"/>
+        <w:numPr>
+          <w:ilvl w:val="0"/>
+          <w:numId w:val="4"/>
+        </w:numPr>
+        <w:rPr>
+          <w:sz w:val="28"/>
+          <w:szCs w:val="28"/>
+        </w:rPr>
+      </w:pPr>
+      <w:r>
+        <w:rPr>
+          <w:sz w:val="28"/>
+          <w:szCs w:val="28"/>
+        </w:rPr>
+        <w:t xml:space="preserve">Update diagrams and documentation, based on </w:t>
+      </w:r>
+      <w:r>
+        <w:rPr>
+          <w:sz w:val="28"/>
+          <w:szCs w:val="28"/>
+        </w:rPr>
+        <w:t xml:space="preserve">the made </w:t>
+      </w:r>
+      <w:r>
+        <w:rPr>
+          <w:sz w:val="28"/>
+          <w:szCs w:val="28"/>
+        </w:rPr>
+        <w:t>progress</w:t>
+      </w:r>
+      <w:r>
+        <w:rPr>
+          <w:sz w:val="28"/>
+          <w:szCs w:val="28"/>
+        </w:rPr>
+        <w:t xml:space="preserve"> and feedback received </w:t>
+      </w:r>
+      <w:r>
+        <w:rPr>
+          <w:sz w:val="28"/>
+          <w:szCs w:val="28"/>
+        </w:rPr>
+        <w:t>–</w:t>
+      </w:r>
+      <w:r>
+        <w:rPr>
+          <w:sz w:val="28"/>
+          <w:szCs w:val="28"/>
+        </w:rPr>
+        <w:t xml:space="preserve"> </w:t>
+      </w:r>
+      <w:r>
+        <w:rPr>
+          <w:sz w:val="28"/>
+          <w:szCs w:val="28"/>
+        </w:rPr>
+        <w:t>✓</w:t>
+      </w:r>
+    </w:p>
+    <w:p>
+      <w:pPr>
+        <w:pStyle w:val="ListParagraph"/>
+        <w:numPr>
+          <w:ilvl w:val="0"/>
+          <w:numId w:val="4"/>
+        </w:numPr>
+        <w:rPr>
+          <w:sz w:val="28"/>
+          <w:szCs w:val="28"/>
+        </w:rPr>
+      </w:pPr>
+      <w:r>
+        <w:rPr>
+          <w:sz w:val="28"/>
+          <w:szCs w:val="28"/>
+        </w:rPr>
+        <w:t xml:space="preserve">Continue seeking feedback – </w:t>
       </w:r>
       <w:r>
         <w:rPr>
@@ -1352,6 +1640,119 @@
 <file path=word/numbering.xml><?xml version="1.0" encoding="utf-8"?>
 <w:numbering xmlns:wpc="http://schemas.microsoft.com/office/word/2010/wordprocessingCanvas" xmlns:cx="http://schemas.microsoft.com/office/drawing/2014/chartex" xmlns:cx1="http://schemas.microsoft.com/office/drawing/2015/9/8/chartex" xmlns:cx2="http://schemas.microsoft.com/office/drawing/2015/10/21/chartex" xmlns:cx3="http://schemas.microsoft.com/office/drawing/2016/5/9/chartex" xmlns:cx4="http://schemas.microsoft.com/office/drawing/2016/5/10/chartex" xmlns:cx5="http://schemas.microsoft.com/office/drawing/2016/5/11/chartex" xmlns:cx6="http://schemas.microsoft.com/office/drawing/2016/5/12/chartex" xmlns:cx7="http://schemas.microsoft.com/office/drawing/2016/5/13/chartex" xmlns:cx8="http://schemas.microsoft.com/office/drawing/2016/5/14/chartex" xmlns:mc="http://schemas.openxmlformats.org/markup-compatibility/2006" xmlns:aink="http://schemas.microsoft.com/office/drawing/2016/ink" xmlns:am3d="http://schemas.microsoft.com/office/drawing/2017/model3d" xmlns:o="urn:schemas-microsoft-com:office:office" xmlns:oel="http://schemas.microsoft.com/office/2019/extlst" xmlns:r="http://schemas.openxmlformats.org/officeDocument/2006/relationships" xmlns:m="http://schemas.openxmlformats.org/officeDocument/2006/math" xmlns:v="urn:schemas-microsoft-com:vml" xmlns:wp14="http://schemas.microsoft.com/office/word/2010/wordprocessingDrawing" xmlns:wp="http://schemas.openxmlformats.org/drawingml/2006/wordprocessingDrawing" xmlns:w10="urn:schemas-microsoft-com:office:word" xmlns:w="http://schemas.openxmlformats.org/wordprocessingml/2006/main" xmlns:w14="http://schemas.microsoft.com/office/word/2010/wordml" xmlns:w15="http://schemas.microsoft.com/office/word/2012/wordml" xmlns:w16cex="http://schemas.microsoft.com/office/word/2018/wordml/cex" xmlns:w16cid="http://schemas.microsoft.com/office/word/2016/wordml/cid" xmlns:w16="http://schemas.microsoft.com/office/word/2018/wordml" xmlns:w16du="http://schemas.microsoft.com/office/word/2023/wordml/word16du" xmlns:w16sdtdh="http://schemas.microsoft.com/office/word/2020/wordml/sdtdatahash" xmlns:w16sdtfl="http://schemas.microsoft.com/office/word/2024/wordml/sdtformatlock" xmlns:w16se="http://schemas.microsoft.com/office/word/2015/wordml/symex" xmlns:wpg="http://schemas.microsoft.com/office/word/2010/wordprocessingGroup" xmlns:wpi="http://schemas.microsoft.com/office/word/2010/wordprocessingInk" xmlns:wne="http://schemas.microsoft.com/office/word/2006/wordml" xmlns:wps="http://schemas.microsoft.com/office/word/2010/wordprocessingShape" mc:Ignorable="w14 w15 w16se w16cid w16 w16cex w16sdtdh w16sdtfl w16du wp14">
   <w:abstractNum w:abstractNumId="0" w15:restartNumberingAfterBreak="0">
+    <w:nsid w:val="25805B0E"/>
+    <w:multiLevelType w:val="hybridMultilevel"/>
+    <w:tmpl w:val="D4F07170"/>
+    <w:lvl w:ilvl="0" w:tplc="04090001">
+      <w:start w:val="1"/>
+      <w:numFmt w:val="bullet"/>
+      <w:lvlText w:val=""/>
+      <w:lvlJc w:val="left"/>
+      <w:pPr>
+        <w:ind w:left="720" w:hanging="360"/>
+      </w:pPr>
+      <w:rPr>
+        <w:rFonts w:ascii="Symbol" w:hAnsi="Symbol" w:hint="default"/>
+      </w:rPr>
+    </w:lvl>
+    <w:lvl w:ilvl="1" w:tplc="04090003" w:tentative="1">
+      <w:start w:val="1"/>
+      <w:numFmt w:val="bullet"/>
+      <w:lvlText w:val="o"/>
+      <w:lvlJc w:val="left"/>
+      <w:pPr>
+        <w:ind w:left="1440" w:hanging="360"/>
+      </w:pPr>
+      <w:rPr>
+        <w:rFonts w:ascii="Courier New" w:hAnsi="Courier New" w:cs="Courier New" w:hint="default"/>
+      </w:rPr>
+    </w:lvl>
+    <w:lvl w:ilvl="2" w:tplc="04090005" w:tentative="1">
+      <w:start w:val="1"/>
+      <w:numFmt w:val="bullet"/>
+      <w:lvlText w:val=""/>
+      <w:lvlJc w:val="left"/>
+      <w:pPr>
+        <w:ind w:left="2160" w:hanging="360"/>
+      </w:pPr>
+      <w:rPr>
+        <w:rFonts w:ascii="Wingdings" w:hAnsi="Wingdings" w:hint="default"/>
+      </w:rPr>
+    </w:lvl>
+    <w:lvl w:ilvl="3" w:tplc="04090001" w:tentative="1">
+      <w:start w:val="1"/>
+      <w:numFmt w:val="bullet"/>
+      <w:lvlText w:val=""/>
+      <w:lvlJc w:val="left"/>
+      <w:pPr>
+        <w:ind w:left="2880" w:hanging="360"/>
+      </w:pPr>
+      <w:rPr>
+        <w:rFonts w:ascii="Symbol" w:hAnsi="Symbol" w:hint="default"/>
+      </w:rPr>
+    </w:lvl>
+    <w:lvl w:ilvl="4" w:tplc="04090003" w:tentative="1">
+      <w:start w:val="1"/>
+      <w:numFmt w:val="bullet"/>
+      <w:lvlText w:val="o"/>
+      <w:lvlJc w:val="left"/>
+      <w:pPr>
+        <w:ind w:left="3600" w:hanging="360"/>
+      </w:pPr>
+      <w:rPr>
+        <w:rFonts w:ascii="Courier New" w:hAnsi="Courier New" w:cs="Courier New" w:hint="default"/>
+      </w:rPr>
+    </w:lvl>
+    <w:lvl w:ilvl="5" w:tplc="04090005" w:tentative="1">
+      <w:start w:val="1"/>
+      <w:numFmt w:val="bullet"/>
+      <w:lvlText w:val=""/>
+      <w:lvlJc w:val="left"/>
+      <w:pPr>
+        <w:ind w:left="4320" w:hanging="360"/>
+      </w:pPr>
+      <w:rPr>
+        <w:rFonts w:ascii="Wingdings" w:hAnsi="Wingdings" w:hint="default"/>
+      </w:rPr>
+    </w:lvl>
+    <w:lvl w:ilvl="6" w:tplc="04090001" w:tentative="1">
+      <w:start w:val="1"/>
+      <w:numFmt w:val="bullet"/>
+      <w:lvlText w:val=""/>
+      <w:lvlJc w:val="left"/>
+      <w:pPr>
+        <w:ind w:left="5040" w:hanging="360"/>
+      </w:pPr>
+      <w:rPr>
+        <w:rFonts w:ascii="Symbol" w:hAnsi="Symbol" w:hint="default"/>
+      </w:rPr>
+    </w:lvl>
+    <w:lvl w:ilvl="7" w:tplc="04090003" w:tentative="1">
+      <w:start w:val="1"/>
+      <w:numFmt w:val="bullet"/>
+      <w:lvlText w:val="o"/>
+      <w:lvlJc w:val="left"/>
+      <w:pPr>
+        <w:ind w:left="5760" w:hanging="360"/>
+      </w:pPr>
+      <w:rPr>
+        <w:rFonts w:ascii="Courier New" w:hAnsi="Courier New" w:cs="Courier New" w:hint="default"/>
+      </w:rPr>
+    </w:lvl>
+    <w:lvl w:ilvl="8" w:tplc="04090005" w:tentative="1">
+      <w:start w:val="1"/>
+      <w:numFmt w:val="bullet"/>
+      <w:lvlText w:val=""/>
+      <w:lvlJc w:val="left"/>
+      <w:pPr>
+        <w:ind w:left="6480" w:hanging="360"/>
+      </w:pPr>
+      <w:rPr>
+        <w:rFonts w:ascii="Wingdings" w:hAnsi="Wingdings" w:hint="default"/>
+      </w:rPr>
+    </w:lvl>
+  </w:abstractNum>
+  <w:abstractNum w:abstractNumId="1" w15:restartNumberingAfterBreak="0">
     <w:nsid w:val="39E366D5"/>
     <w:multiLevelType w:val="hybridMultilevel"/>
     <w:tmpl w:val="9042B478"/>
@@ -1464,7 +1865,7 @@
       </w:rPr>
     </w:lvl>
   </w:abstractNum>
-  <w:abstractNum w:abstractNumId="1" w15:restartNumberingAfterBreak="0">
+  <w:abstractNum w:abstractNumId="2" w15:restartNumberingAfterBreak="0">
     <w:nsid w:val="47776B4B"/>
     <w:multiLevelType w:val="hybridMultilevel"/>
     <w:tmpl w:val="C28625EE"/>
@@ -1577,7 +1978,7 @@
       </w:rPr>
     </w:lvl>
   </w:abstractNum>
-  <w:abstractNum w:abstractNumId="2" w15:restartNumberingAfterBreak="0">
+  <w:abstractNum w:abstractNumId="3" w15:restartNumberingAfterBreak="0">
     <w:nsid w:val="626E6CA3"/>
     <w:multiLevelType w:val="hybridMultilevel"/>
     <w:tmpl w:val="15A6C858"/>
@@ -1691,13 +2092,16 @@
     </w:lvl>
   </w:abstractNum>
   <w:num w:numId="1" w16cid:durableId="1969165278">
+    <w:abstractNumId w:val="3"/>
+  </w:num>
+  <w:num w:numId="2" w16cid:durableId="806168282">
+    <w:abstractNumId w:val="1"/>
+  </w:num>
+  <w:num w:numId="3" w16cid:durableId="638539266">
     <w:abstractNumId w:val="2"/>
   </w:num>
-  <w:num w:numId="2" w16cid:durableId="806168282">
+  <w:num w:numId="4" w16cid:durableId="1394766739">
     <w:abstractNumId w:val="0"/>
-  </w:num>
-  <w:num w:numId="3" w16cid:durableId="638539266">
-    <w:abstractNumId w:val="1"/>
   </w:num>
 </w:numbering>
 </file>

</xml_diff>